<commit_message>
:books:docs: Desenvolvimento do modal de recusa
</commit_message>
<xml_diff>
--- a/Documentation/WORD/Sprint13_Task111_modal_de_recusa.docx
+++ b/Documentation/WORD/Sprint13_Task111_modal_de_recusa.docx
@@ -776,7 +776,7 @@
           </w:tcPr>
           <w:p>
             <w:r>
-              <w:t>5</w:t>
+              <w:t>10</w:t>
             </w:r>
             <w:r>
               <w:t xml:space="preserve"> horas</w:t>
@@ -789,7 +789,7 @@
           </w:tcPr>
           <w:p>
             <w:r>
-              <w:t>5</w:t>
+              <w:t>10</w:t>
             </w:r>
             <w:r>
               <w:t xml:space="preserve"> horas</w:t>
@@ -2211,6 +2211,7 @@
   <w:style w:type="character" w:default="1" w:styleId="Fontepargpadro">
     <w:name w:val="Default Paragraph Font"/>
     <w:uiPriority w:val="1"/>
+    <w:semiHidden/>
     <w:unhideWhenUsed/>
   </w:style>
   <w:style w:type="table" w:default="1" w:styleId="Tabelanormal">

</xml_diff>